<commit_message>
nombre en cada reporte
</commit_message>
<xml_diff>
--- a/Reportes Lecturas/Reporte 1 - ¿Querés predecir el futuro Usá datos.docx
+++ b/Reportes Lecturas/Reporte 1 - ¿Querés predecir el futuro Usá datos.docx
@@ -73,7 +73,19 @@
       </w:r>
       <w:proofErr w:type="spellEnd"/>
     </w:p>
-    <w:p/>
+    <w:p>
+      <w:pPr>
+        <w:jc w:val="center"/>
+      </w:pPr>
+      <w:r>
+        <w:t>Sebastián Aguilar Benavides</w:t>
+      </w:r>
+    </w:p>
+    <w:p>
+      <w:pPr>
+        <w:jc w:val="center"/>
+      </w:pPr>
+    </w:p>
     <w:p>
       <w:r>
         <w:t xml:space="preserve">La charla </w:t>

</xml_diff>